<commit_message>
Show what to have on screen for each section of the walkthrough
</commit_message>
<xml_diff>
--- a/demo/walkthrough.docx
+++ b/demo/walkthrough.docx
@@ -393,6 +393,118 @@
         </w:rPr>
         <w:t>The backend is Django 5.2 with Django REST Framework; the frontend is a React client built with Vite. Stations come from the supplied OPIS price file. A request makes one upstream routing call, and a repeat of the same pair is served from the database.</w:t>
       </w:r>
+    </w:p>
+    <w:p>
+      <w:pPr>
+        <w:spacing w:before="0" w:after="60"/>
+      </w:pPr>
+      <w:r>
+        <w:rPr>
+          <w:b/>
+          <w:i w:val="0"/>
+          <w:color w:val="1D4ED8"/>
+          <w:sz w:val="15"/>
+        </w:rPr>
+        <w:t>On screen while you present this</w:t>
+      </w:r>
+    </w:p>
+    <w:tbl>
+      <w:tblPr>
+        <w:tblW w:type="auto" w:w="0"/>
+        <w:tblLayout w:type="fixed"/>
+        <w:tblLook w:firstColumn="1" w:firstRow="1" w:lastColumn="0" w:lastRow="0" w:noHBand="0" w:noVBand="1" w:val="04A0"/>
+      </w:tblPr>
+      <w:tblGrid>
+        <w:gridCol w:w="4730"/>
+        <w:gridCol w:w="4730"/>
+      </w:tblGrid>
+      <w:tr>
+        <w:tc>
+          <w:tcPr>
+            <w:tcW w:type="dxa" w:w="1123"/>
+            <w:shd w:val="clear" w:color="auto" w:fill="E7EDFA"/>
+          </w:tcPr>
+          <w:p>
+            <w:r>
+              <w:rPr>
+                <w:b/>
+                <w:color w:val="1D4ED8"/>
+                <w:sz w:val="15"/>
+              </w:rPr>
+              <w:t>CLIENT</w:t>
+            </w:r>
+          </w:p>
+        </w:tc>
+        <w:tc>
+          <w:tcPr>
+            <w:tcW w:type="dxa" w:w="8093"/>
+            <w:shd w:val="clear" w:color="auto" w:fill="F6F8FD"/>
+          </w:tcPr>
+          <w:p>
+            <w:r>
+              <w:rPr>
+                <w:rFonts w:ascii="Consolas" w:hAnsi="Consolas"/>
+                <w:sz w:val="19"/>
+              </w:rPr>
+              <w:t>https://spotter-fuel-route-web.vercel.app/</w:t>
+            </w:r>
+            <w:r>
+              <w:rPr>
+                <w:i/>
+                <w:color w:val="6B7689"/>
+                <w:sz w:val="17"/>
+              </w:rPr>
+              <w:t xml:space="preserve"> the app you will show in a moment</w:t>
+            </w:r>
+          </w:p>
+        </w:tc>
+      </w:tr>
+      <w:tr>
+        <w:tc>
+          <w:tcPr>
+            <w:tcW w:type="dxa" w:w="1123"/>
+            <w:shd w:val="clear" w:color="auto" w:fill="E7EDFA"/>
+          </w:tcPr>
+          <w:p>
+            <w:r>
+              <w:rPr>
+                <w:b/>
+                <w:color w:val="1D4ED8"/>
+                <w:sz w:val="15"/>
+              </w:rPr>
+              <w:t>API</w:t>
+            </w:r>
+          </w:p>
+        </w:tc>
+        <w:tc>
+          <w:tcPr>
+            <w:tcW w:type="dxa" w:w="8093"/>
+            <w:shd w:val="clear" w:color="auto" w:fill="F6F8FD"/>
+          </w:tcPr>
+          <w:p>
+            <w:r>
+              <w:rPr>
+                <w:rFonts w:ascii="Consolas" w:hAnsi="Consolas"/>
+                <w:sz w:val="19"/>
+              </w:rPr>
+              <w:t>https://spotter-fuel-route.vercel.app/api/v1/docs/</w:t>
+            </w:r>
+            <w:r>
+              <w:rPr>
+                <w:i/>
+                <w:color w:val="6B7689"/>
+                <w:sz w:val="17"/>
+              </w:rPr>
+              <w:t xml:space="preserve"> the API you will show in a moment</w:t>
+            </w:r>
+          </w:p>
+        </w:tc>
+      </w:tr>
+    </w:tbl>
+    <w:p>
+      <w:pPr>
+        <w:spacing w:after="80"/>
+      </w:pPr>
     </w:p>
     <w:p>
       <w:pPr>
@@ -510,6 +622,77 @@
     </w:p>
     <w:p>
       <w:pPr>
+        <w:spacing w:before="0" w:after="60"/>
+      </w:pPr>
+      <w:r>
+        <w:rPr>
+          <w:b/>
+          <w:i w:val="0"/>
+          <w:color w:val="1D4ED8"/>
+          <w:sz w:val="15"/>
+        </w:rPr>
+        <w:t>On screen while you present this</w:t>
+      </w:r>
+    </w:p>
+    <w:tbl>
+      <w:tblPr>
+        <w:tblW w:type="auto" w:w="0"/>
+        <w:tblLayout w:type="fixed"/>
+        <w:tblLook w:firstColumn="1" w:firstRow="1" w:lastColumn="0" w:lastRow="0" w:noHBand="0" w:noVBand="1" w:val="04A0"/>
+      </w:tblPr>
+      <w:tblGrid>
+        <w:gridCol w:w="4730"/>
+        <w:gridCol w:w="4730"/>
+      </w:tblGrid>
+      <w:tr>
+        <w:tc>
+          <w:tcPr>
+            <w:tcW w:type="dxa" w:w="1123"/>
+            <w:shd w:val="clear" w:color="auto" w:fill="E7EDFA"/>
+          </w:tcPr>
+          <w:p>
+            <w:r>
+              <w:rPr>
+                <w:b/>
+                <w:color w:val="1D4ED8"/>
+                <w:sz w:val="15"/>
+              </w:rPr>
+              <w:t>RUN</w:t>
+            </w:r>
+          </w:p>
+        </w:tc>
+        <w:tc>
+          <w:tcPr>
+            <w:tcW w:type="dxa" w:w="8093"/>
+            <w:shd w:val="clear" w:color="auto" w:fill="F6F8FD"/>
+          </w:tcPr>
+          <w:p>
+            <w:r>
+              <w:rPr>
+                <w:rFonts w:ascii="Consolas" w:hAnsi="Consolas"/>
+                <w:sz w:val="19"/>
+              </w:rPr>
+              <w:t>docker compose up --build</w:t>
+            </w:r>
+            <w:r>
+              <w:rPr>
+                <w:i/>
+                <w:color w:val="6B7689"/>
+                <w:sz w:val="17"/>
+              </w:rPr>
+              <w:t xml:space="preserve"> in the repository root, then the curl below</w:t>
+            </w:r>
+          </w:p>
+        </w:tc>
+      </w:tr>
+    </w:tbl>
+    <w:p>
+      <w:pPr>
+        <w:spacing w:after="80"/>
+      </w:pPr>
+    </w:p>
+    <w:p>
+      <w:pPr>
         <w:spacing w:before="160" w:after="60"/>
         <w:jc w:val="center"/>
       </w:pPr>
@@ -624,6 +807,118 @@
     </w:p>
     <w:p>
       <w:pPr>
+        <w:spacing w:before="0" w:after="60"/>
+      </w:pPr>
+      <w:r>
+        <w:rPr>
+          <w:b/>
+          <w:i w:val="0"/>
+          <w:color w:val="1D4ED8"/>
+          <w:sz w:val="15"/>
+        </w:rPr>
+        <w:t>On screen while you present this</w:t>
+      </w:r>
+    </w:p>
+    <w:tbl>
+      <w:tblPr>
+        <w:tblW w:type="auto" w:w="0"/>
+        <w:tblLayout w:type="fixed"/>
+        <w:tblLook w:firstColumn="1" w:firstRow="1" w:lastColumn="0" w:lastRow="0" w:noHBand="0" w:noVBand="1" w:val="04A0"/>
+      </w:tblPr>
+      <w:tblGrid>
+        <w:gridCol w:w="4730"/>
+        <w:gridCol w:w="4730"/>
+      </w:tblGrid>
+      <w:tr>
+        <w:tc>
+          <w:tcPr>
+            <w:tcW w:type="dxa" w:w="1123"/>
+            <w:shd w:val="clear" w:color="auto" w:fill="E7EDFA"/>
+          </w:tcPr>
+          <w:p>
+            <w:r>
+              <w:rPr>
+                <w:b/>
+                <w:color w:val="1D4ED8"/>
+                <w:sz w:val="15"/>
+              </w:rPr>
+              <w:t>OPEN</w:t>
+            </w:r>
+          </w:p>
+        </w:tc>
+        <w:tc>
+          <w:tcPr>
+            <w:tcW w:type="dxa" w:w="8093"/>
+            <w:shd w:val="clear" w:color="auto" w:fill="F6F8FD"/>
+          </w:tcPr>
+          <w:p>
+            <w:r>
+              <w:rPr>
+                <w:rFonts w:ascii="Consolas" w:hAnsi="Consolas"/>
+                <w:sz w:val="19"/>
+              </w:rPr>
+              <w:t>https://spotter-fuel-route.vercel.app/api/v1/docs/</w:t>
+            </w:r>
+            <w:r>
+              <w:rPr>
+                <w:i/>
+                <w:color w:val="6B7689"/>
+                <w:sz w:val="17"/>
+              </w:rPr>
+              <w:t xml:space="preserve"> Swagger, then POST /api/v1/fuel-plan/ → Try it out</w:t>
+            </w:r>
+          </w:p>
+        </w:tc>
+      </w:tr>
+      <w:tr>
+        <w:tc>
+          <w:tcPr>
+            <w:tcW w:type="dxa" w:w="1123"/>
+            <w:shd w:val="clear" w:color="auto" w:fill="E7EDFA"/>
+          </w:tcPr>
+          <w:p>
+            <w:r>
+              <w:rPr>
+                <w:b/>
+                <w:color w:val="1D4ED8"/>
+                <w:sz w:val="15"/>
+              </w:rPr>
+              <w:t>OR</w:t>
+            </w:r>
+          </w:p>
+        </w:tc>
+        <w:tc>
+          <w:tcPr>
+            <w:tcW w:type="dxa" w:w="8093"/>
+            <w:shd w:val="clear" w:color="auto" w:fill="F6F8FD"/>
+          </w:tcPr>
+          <w:p>
+            <w:r>
+              <w:rPr>
+                <w:rFonts w:ascii="Consolas" w:hAnsi="Consolas"/>
+                <w:sz w:val="19"/>
+              </w:rPr>
+              <w:t>https://spotter-fuel-route.vercel.app/api/v1/schema/</w:t>
+            </w:r>
+            <w:r>
+              <w:rPr>
+                <w:i/>
+                <w:color w:val="6B7689"/>
+                <w:sz w:val="17"/>
+              </w:rPr>
+              <w:t xml:space="preserve"> the raw OpenAPI 3 document</w:t>
+            </w:r>
+          </w:p>
+        </w:tc>
+      </w:tr>
+    </w:tbl>
+    <w:p>
+      <w:pPr>
+        <w:spacing w:after="80"/>
+      </w:pPr>
+    </w:p>
+    <w:p>
+      <w:pPr>
         <w:spacing w:before="160" w:after="60"/>
         <w:jc w:val="center"/>
       </w:pPr>
@@ -738,6 +1033,118 @@
     </w:p>
     <w:p>
       <w:pPr>
+        <w:spacing w:before="0" w:after="60"/>
+      </w:pPr>
+      <w:r>
+        <w:rPr>
+          <w:b/>
+          <w:i w:val="0"/>
+          <w:color w:val="1D4ED8"/>
+          <w:sz w:val="15"/>
+        </w:rPr>
+        <w:t>On screen while you present this</w:t>
+      </w:r>
+    </w:p>
+    <w:tbl>
+      <w:tblPr>
+        <w:tblW w:type="auto" w:w="0"/>
+        <w:tblLayout w:type="fixed"/>
+        <w:tblLook w:firstColumn="1" w:firstRow="1" w:lastColumn="0" w:lastRow="0" w:noHBand="0" w:noVBand="1" w:val="04A0"/>
+      </w:tblPr>
+      <w:tblGrid>
+        <w:gridCol w:w="4730"/>
+        <w:gridCol w:w="4730"/>
+      </w:tblGrid>
+      <w:tr>
+        <w:tc>
+          <w:tcPr>
+            <w:tcW w:type="dxa" w:w="1123"/>
+            <w:shd w:val="clear" w:color="auto" w:fill="E7EDFA"/>
+          </w:tcPr>
+          <w:p>
+            <w:r>
+              <w:rPr>
+                <w:b/>
+                <w:color w:val="1D4ED8"/>
+                <w:sz w:val="15"/>
+              </w:rPr>
+              <w:t>OPEN</w:t>
+            </w:r>
+          </w:p>
+        </w:tc>
+        <w:tc>
+          <w:tcPr>
+            <w:tcW w:type="dxa" w:w="8093"/>
+            <w:shd w:val="clear" w:color="auto" w:fill="F6F8FD"/>
+          </w:tcPr>
+          <w:p>
+            <w:r>
+              <w:rPr>
+                <w:rFonts w:ascii="Consolas" w:hAnsi="Consolas"/>
+                <w:sz w:val="19"/>
+              </w:rPr>
+              <w:t>https://spotter-fuel-route-web.vercel.app/</w:t>
+            </w:r>
+            <w:r>
+              <w:rPr>
+                <w:i/>
+                <w:color w:val="6B7689"/>
+                <w:sz w:val="17"/>
+              </w:rPr>
+              <w:t xml:space="preserve"> this exact page, then read on</w:t>
+            </w:r>
+          </w:p>
+        </w:tc>
+      </w:tr>
+      <w:tr>
+        <w:tc>
+          <w:tcPr>
+            <w:tcW w:type="dxa" w:w="1123"/>
+            <w:shd w:val="clear" w:color="auto" w:fill="E7EDFA"/>
+          </w:tcPr>
+          <w:p>
+            <w:r>
+              <w:rPr>
+                <w:b/>
+                <w:color w:val="1D4ED8"/>
+                <w:sz w:val="15"/>
+              </w:rPr>
+              <w:t>TYPE</w:t>
+            </w:r>
+          </w:p>
+        </w:tc>
+        <w:tc>
+          <w:tcPr>
+            <w:tcW w:type="dxa" w:w="8093"/>
+            <w:shd w:val="clear" w:color="auto" w:fill="F6F8FD"/>
+          </w:tcPr>
+          <w:p>
+            <w:r>
+              <w:rPr>
+                <w:rFonts w:ascii="Consolas" w:hAnsi="Consolas"/>
+                <w:sz w:val="19"/>
+              </w:rPr>
+              <w:t>New York, NY  →  Los Angeles, CA</w:t>
+            </w:r>
+            <w:r>
+              <w:rPr>
+                <w:i/>
+                <w:color w:val="6B7689"/>
+                <w:sz w:val="17"/>
+              </w:rPr>
+              <w:t xml:space="preserve"> then press Compute optimal plan</w:t>
+            </w:r>
+          </w:p>
+        </w:tc>
+      </w:tr>
+    </w:tbl>
+    <w:p>
+      <w:pPr>
+        <w:spacing w:after="80"/>
+      </w:pPr>
+    </w:p>
+    <w:p>
+      <w:pPr>
         <w:spacing w:before="160" w:after="60"/>
         <w:jc w:val="center"/>
       </w:pPr>
@@ -852,6 +1259,118 @@
     </w:p>
     <w:p>
       <w:pPr>
+        <w:spacing w:before="0" w:after="60"/>
+      </w:pPr>
+      <w:r>
+        <w:rPr>
+          <w:b/>
+          <w:i w:val="0"/>
+          <w:color w:val="1D4ED8"/>
+          <w:sz w:val="15"/>
+        </w:rPr>
+        <w:t>On screen while you present this</w:t>
+      </w:r>
+    </w:p>
+    <w:tbl>
+      <w:tblPr>
+        <w:tblW w:type="auto" w:w="0"/>
+        <w:tblLayout w:type="fixed"/>
+        <w:tblLook w:firstColumn="1" w:firstRow="1" w:lastColumn="0" w:lastRow="0" w:noHBand="0" w:noVBand="1" w:val="04A0"/>
+      </w:tblPr>
+      <w:tblGrid>
+        <w:gridCol w:w="4730"/>
+        <w:gridCol w:w="4730"/>
+      </w:tblGrid>
+      <w:tr>
+        <w:tc>
+          <w:tcPr>
+            <w:tcW w:type="dxa" w:w="1123"/>
+            <w:shd w:val="clear" w:color="auto" w:fill="E7EDFA"/>
+          </w:tcPr>
+          <w:p>
+            <w:r>
+              <w:rPr>
+                <w:b/>
+                <w:color w:val="1D4ED8"/>
+                <w:sz w:val="15"/>
+              </w:rPr>
+              <w:t>OPEN</w:t>
+            </w:r>
+          </w:p>
+        </w:tc>
+        <w:tc>
+          <w:tcPr>
+            <w:tcW w:type="dxa" w:w="8093"/>
+            <w:shd w:val="clear" w:color="auto" w:fill="F6F8FD"/>
+          </w:tcPr>
+          <w:p>
+            <w:r>
+              <w:rPr>
+                <w:rFonts w:ascii="Consolas" w:hAnsi="Consolas"/>
+                <w:sz w:val="19"/>
+              </w:rPr>
+              <w:t>https://spotter-fuel-route-web.vercel.app/</w:t>
+            </w:r>
+            <w:r>
+              <w:rPr>
+                <w:i/>
+                <w:color w:val="6B7689"/>
+                <w:sz w:val="17"/>
+              </w:rPr>
+              <w:t xml:space="preserve"> the same page, scrolled to the manifest</w:t>
+            </w:r>
+          </w:p>
+        </w:tc>
+      </w:tr>
+      <w:tr>
+        <w:tc>
+          <w:tcPr>
+            <w:tcW w:type="dxa" w:w="1123"/>
+            <w:shd w:val="clear" w:color="auto" w:fill="E7EDFA"/>
+          </w:tcPr>
+          <w:p>
+            <w:r>
+              <w:rPr>
+                <w:b/>
+                <w:color w:val="1D4ED8"/>
+                <w:sz w:val="15"/>
+              </w:rPr>
+              <w:t>OR</w:t>
+            </w:r>
+          </w:p>
+        </w:tc>
+        <w:tc>
+          <w:tcPr>
+            <w:tcW w:type="dxa" w:w="8093"/>
+            <w:shd w:val="clear" w:color="auto" w:fill="F6F8FD"/>
+          </w:tcPr>
+          <w:p>
+            <w:r>
+              <w:rPr>
+                <w:rFonts w:ascii="Consolas" w:hAnsi="Consolas"/>
+                <w:sz w:val="19"/>
+              </w:rPr>
+              <w:t>https://spotter-fuel-route.vercel.app/api/v1/fuel-plan/</w:t>
+            </w:r>
+            <w:r>
+              <w:rPr>
+                <w:i/>
+                <w:color w:val="6B7689"/>
+                <w:sz w:val="17"/>
+              </w:rPr>
+              <w:t xml:space="preserve"> POST the same pair and read fuel_stops</w:t>
+            </w:r>
+          </w:p>
+        </w:tc>
+      </w:tr>
+    </w:tbl>
+    <w:p>
+      <w:pPr>
+        <w:spacing w:after="80"/>
+      </w:pPr>
+    </w:p>
+    <w:p>
+      <w:pPr>
         <w:spacing w:before="160" w:after="60"/>
         <w:jc w:val="center"/>
       </w:pPr>
@@ -953,6 +1472,118 @@
     </w:p>
     <w:p>
       <w:pPr>
+        <w:spacing w:before="0" w:after="60"/>
+      </w:pPr>
+      <w:r>
+        <w:rPr>
+          <w:b/>
+          <w:i w:val="0"/>
+          <w:color w:val="1D4ED8"/>
+          <w:sz w:val="15"/>
+        </w:rPr>
+        <w:t>On screen while you present this</w:t>
+      </w:r>
+    </w:p>
+    <w:tbl>
+      <w:tblPr>
+        <w:tblW w:type="auto" w:w="0"/>
+        <w:tblLayout w:type="fixed"/>
+        <w:tblLook w:firstColumn="1" w:firstRow="1" w:lastColumn="0" w:lastRow="0" w:noHBand="0" w:noVBand="1" w:val="04A0"/>
+      </w:tblPr>
+      <w:tblGrid>
+        <w:gridCol w:w="4730"/>
+        <w:gridCol w:w="4730"/>
+      </w:tblGrid>
+      <w:tr>
+        <w:tc>
+          <w:tcPr>
+            <w:tcW w:type="dxa" w:w="1123"/>
+            <w:shd w:val="clear" w:color="auto" w:fill="E7EDFA"/>
+          </w:tcPr>
+          <w:p>
+            <w:r>
+              <w:rPr>
+                <w:b/>
+                <w:color w:val="1D4ED8"/>
+                <w:sz w:val="15"/>
+              </w:rPr>
+              <w:t>OPEN</w:t>
+            </w:r>
+          </w:p>
+        </w:tc>
+        <w:tc>
+          <w:tcPr>
+            <w:tcW w:type="dxa" w:w="8093"/>
+            <w:shd w:val="clear" w:color="auto" w:fill="F6F8FD"/>
+          </w:tcPr>
+          <w:p>
+            <w:r>
+              <w:rPr>
+                <w:rFonts w:ascii="Consolas" w:hAnsi="Consolas"/>
+                <w:sz w:val="19"/>
+              </w:rPr>
+              <w:t>https://spotter-fuel-route-web.vercel.app/</w:t>
+            </w:r>
+            <w:r>
+              <w:rPr>
+                <w:i/>
+                <w:color w:val="6B7689"/>
+                <w:sz w:val="17"/>
+              </w:rPr>
+              <w:t xml:space="preserve"> then click the Stations tab along the top</w:t>
+            </w:r>
+          </w:p>
+        </w:tc>
+      </w:tr>
+      <w:tr>
+        <w:tc>
+          <w:tcPr>
+            <w:tcW w:type="dxa" w:w="1123"/>
+            <w:shd w:val="clear" w:color="auto" w:fill="E7EDFA"/>
+          </w:tcPr>
+          <w:p>
+            <w:r>
+              <w:rPr>
+                <w:b/>
+                <w:color w:val="1D4ED8"/>
+                <w:sz w:val="15"/>
+              </w:rPr>
+              <w:t>OR</w:t>
+            </w:r>
+          </w:p>
+        </w:tc>
+        <w:tc>
+          <w:tcPr>
+            <w:tcW w:type="dxa" w:w="8093"/>
+            <w:shd w:val="clear" w:color="auto" w:fill="F6F8FD"/>
+          </w:tcPr>
+          <w:p>
+            <w:r>
+              <w:rPr>
+                <w:rFonts w:ascii="Consolas" w:hAnsi="Consolas"/>
+                <w:sz w:val="19"/>
+              </w:rPr>
+              <w:t>https://spotter-fuel-route.vercel.app/api/v1/stations/?limit=20</w:t>
+            </w:r>
+            <w:r>
+              <w:rPr>
+                <w:i/>
+                <w:color w:val="6B7689"/>
+                <w:sz w:val="17"/>
+              </w:rPr>
+              <w:t xml:space="preserve"> the same list as JSON</w:t>
+            </w:r>
+          </w:p>
+        </w:tc>
+      </w:tr>
+    </w:tbl>
+    <w:p>
+      <w:pPr>
+        <w:spacing w:after="80"/>
+      </w:pPr>
+    </w:p>
+    <w:p>
+      <w:pPr>
         <w:spacing w:before="160" w:after="60"/>
         <w:jc w:val="center"/>
       </w:pPr>
@@ -1054,6 +1685,77 @@
     </w:p>
     <w:p>
       <w:pPr>
+        <w:spacing w:before="0" w:after="60"/>
+      </w:pPr>
+      <w:r>
+        <w:rPr>
+          <w:b/>
+          <w:i w:val="0"/>
+          <w:color w:val="1D4ED8"/>
+          <w:sz w:val="15"/>
+        </w:rPr>
+        <w:t>On screen while you present this</w:t>
+      </w:r>
+    </w:p>
+    <w:tbl>
+      <w:tblPr>
+        <w:tblW w:type="auto" w:w="0"/>
+        <w:tblLayout w:type="fixed"/>
+        <w:tblLook w:firstColumn="1" w:firstRow="1" w:lastColumn="0" w:lastRow="0" w:noHBand="0" w:noVBand="1" w:val="04A0"/>
+      </w:tblPr>
+      <w:tblGrid>
+        <w:gridCol w:w="4730"/>
+        <w:gridCol w:w="4730"/>
+      </w:tblGrid>
+      <w:tr>
+        <w:tc>
+          <w:tcPr>
+            <w:tcW w:type="dxa" w:w="1123"/>
+            <w:shd w:val="clear" w:color="auto" w:fill="E7EDFA"/>
+          </w:tcPr>
+          <w:p>
+            <w:r>
+              <w:rPr>
+                <w:b/>
+                <w:color w:val="1D4ED8"/>
+                <w:sz w:val="15"/>
+              </w:rPr>
+              <w:t>OPEN</w:t>
+            </w:r>
+          </w:p>
+        </w:tc>
+        <w:tc>
+          <w:tcPr>
+            <w:tcW w:type="dxa" w:w="8093"/>
+            <w:shd w:val="clear" w:color="auto" w:fill="F6F8FD"/>
+          </w:tcPr>
+          <w:p>
+            <w:r>
+              <w:rPr>
+                <w:rFonts w:ascii="Consolas" w:hAnsi="Consolas"/>
+                <w:sz w:val="19"/>
+              </w:rPr>
+              <w:t>routing/models.py</w:t>
+            </w:r>
+            <w:r>
+              <w:rPr>
+                <w:i/>
+                <w:color w:val="6B7689"/>
+                <w:sz w:val="17"/>
+              </w:rPr>
+              <w:t xml:space="preserve"> lines 19–48</w:t>
+            </w:r>
+          </w:p>
+        </w:tc>
+      </w:tr>
+    </w:tbl>
+    <w:p>
+      <w:pPr>
+        <w:spacing w:after="80"/>
+      </w:pPr>
+    </w:p>
+    <w:p>
+      <w:pPr>
         <w:spacing w:before="160" w:after="60"/>
         <w:jc w:val="center"/>
       </w:pPr>
@@ -1155,6 +1857,77 @@
     </w:p>
     <w:p>
       <w:pPr>
+        <w:spacing w:before="0" w:after="60"/>
+      </w:pPr>
+      <w:r>
+        <w:rPr>
+          <w:b/>
+          <w:i w:val="0"/>
+          <w:color w:val="1D4ED8"/>
+          <w:sz w:val="15"/>
+        </w:rPr>
+        <w:t>On screen while you present this</w:t>
+      </w:r>
+    </w:p>
+    <w:tbl>
+      <w:tblPr>
+        <w:tblW w:type="auto" w:w="0"/>
+        <w:tblLayout w:type="fixed"/>
+        <w:tblLook w:firstColumn="1" w:firstRow="1" w:lastColumn="0" w:lastRow="0" w:noHBand="0" w:noVBand="1" w:val="04A0"/>
+      </w:tblPr>
+      <w:tblGrid>
+        <w:gridCol w:w="4730"/>
+        <w:gridCol w:w="4730"/>
+      </w:tblGrid>
+      <w:tr>
+        <w:tc>
+          <w:tcPr>
+            <w:tcW w:type="dxa" w:w="1123"/>
+            <w:shd w:val="clear" w:color="auto" w:fill="E7EDFA"/>
+          </w:tcPr>
+          <w:p>
+            <w:r>
+              <w:rPr>
+                <w:b/>
+                <w:color w:val="1D4ED8"/>
+                <w:sz w:val="15"/>
+              </w:rPr>
+              <w:t>OPEN</w:t>
+            </w:r>
+          </w:p>
+        </w:tc>
+        <w:tc>
+          <w:tcPr>
+            <w:tcW w:type="dxa" w:w="8093"/>
+            <w:shd w:val="clear" w:color="auto" w:fill="F6F8FD"/>
+          </w:tcPr>
+          <w:p>
+            <w:r>
+              <w:rPr>
+                <w:rFonts w:ascii="Consolas" w:hAnsi="Consolas"/>
+                <w:sz w:val="19"/>
+              </w:rPr>
+              <w:t>routing/views.py</w:t>
+            </w:r>
+            <w:r>
+              <w:rPr>
+                <w:i/>
+                <w:color w:val="6B7689"/>
+                <w:sz w:val="17"/>
+              </w:rPr>
+              <w:t xml:space="preserve"> lines 50–83</w:t>
+            </w:r>
+          </w:p>
+        </w:tc>
+      </w:tr>
+    </w:tbl>
+    <w:p>
+      <w:pPr>
+        <w:spacing w:after="80"/>
+      </w:pPr>
+    </w:p>
+    <w:p>
+      <w:pPr>
         <w:spacing w:before="160" w:after="60"/>
         <w:jc w:val="center"/>
       </w:pPr>
@@ -1269,6 +2042,77 @@
     </w:p>
     <w:p>
       <w:pPr>
+        <w:spacing w:before="0" w:after="60"/>
+      </w:pPr>
+      <w:r>
+        <w:rPr>
+          <w:b/>
+          <w:i w:val="0"/>
+          <w:color w:val="1D4ED8"/>
+          <w:sz w:val="15"/>
+        </w:rPr>
+        <w:t>On screen while you present this</w:t>
+      </w:r>
+    </w:p>
+    <w:tbl>
+      <w:tblPr>
+        <w:tblW w:type="auto" w:w="0"/>
+        <w:tblLayout w:type="fixed"/>
+        <w:tblLook w:firstColumn="1" w:firstRow="1" w:lastColumn="0" w:lastRow="0" w:noHBand="0" w:noVBand="1" w:val="04A0"/>
+      </w:tblPr>
+      <w:tblGrid>
+        <w:gridCol w:w="4730"/>
+        <w:gridCol w:w="4730"/>
+      </w:tblGrid>
+      <w:tr>
+        <w:tc>
+          <w:tcPr>
+            <w:tcW w:type="dxa" w:w="1123"/>
+            <w:shd w:val="clear" w:color="auto" w:fill="E7EDFA"/>
+          </w:tcPr>
+          <w:p>
+            <w:r>
+              <w:rPr>
+                <w:b/>
+                <w:color w:val="1D4ED8"/>
+                <w:sz w:val="15"/>
+              </w:rPr>
+              <w:t>OPEN</w:t>
+            </w:r>
+          </w:p>
+        </w:tc>
+        <w:tc>
+          <w:tcPr>
+            <w:tcW w:type="dxa" w:w="8093"/>
+            <w:shd w:val="clear" w:color="auto" w:fill="F6F8FD"/>
+          </w:tcPr>
+          <w:p>
+            <w:r>
+              <w:rPr>
+                <w:rFonts w:ascii="Consolas" w:hAnsi="Consolas"/>
+                <w:sz w:val="19"/>
+              </w:rPr>
+              <w:t>routing/services/optimizer.py</w:t>
+            </w:r>
+            <w:r>
+              <w:rPr>
+                <w:i/>
+                <w:color w:val="6B7689"/>
+                <w:sz w:val="17"/>
+              </w:rPr>
+              <w:t xml:space="preserve"> lines 132–165</w:t>
+            </w:r>
+          </w:p>
+        </w:tc>
+      </w:tr>
+    </w:tbl>
+    <w:p>
+      <w:pPr>
+        <w:spacing w:after="80"/>
+      </w:pPr>
+    </w:p>
+    <w:p>
+      <w:pPr>
         <w:spacing w:before="160" w:after="60"/>
         <w:jc w:val="center"/>
       </w:pPr>
@@ -1383,6 +2227,77 @@
     </w:p>
     <w:p>
       <w:pPr>
+        <w:spacing w:before="0" w:after="60"/>
+      </w:pPr>
+      <w:r>
+        <w:rPr>
+          <w:b/>
+          <w:i w:val="0"/>
+          <w:color w:val="1D4ED8"/>
+          <w:sz w:val="15"/>
+        </w:rPr>
+        <w:t>On screen while you present this</w:t>
+      </w:r>
+    </w:p>
+    <w:tbl>
+      <w:tblPr>
+        <w:tblW w:type="auto" w:w="0"/>
+        <w:tblLayout w:type="fixed"/>
+        <w:tblLook w:firstColumn="1" w:firstRow="1" w:lastColumn="0" w:lastRow="0" w:noHBand="0" w:noVBand="1" w:val="04A0"/>
+      </w:tblPr>
+      <w:tblGrid>
+        <w:gridCol w:w="4730"/>
+        <w:gridCol w:w="4730"/>
+      </w:tblGrid>
+      <w:tr>
+        <w:tc>
+          <w:tcPr>
+            <w:tcW w:type="dxa" w:w="1123"/>
+            <w:shd w:val="clear" w:color="auto" w:fill="E7EDFA"/>
+          </w:tcPr>
+          <w:p>
+            <w:r>
+              <w:rPr>
+                <w:b/>
+                <w:color w:val="1D4ED8"/>
+                <w:sz w:val="15"/>
+              </w:rPr>
+              <w:t>OPEN</w:t>
+            </w:r>
+          </w:p>
+        </w:tc>
+        <w:tc>
+          <w:tcPr>
+            <w:tcW w:type="dxa" w:w="8093"/>
+            <w:shd w:val="clear" w:color="auto" w:fill="F6F8FD"/>
+          </w:tcPr>
+          <w:p>
+            <w:r>
+              <w:rPr>
+                <w:rFonts w:ascii="Consolas" w:hAnsi="Consolas"/>
+                <w:sz w:val="19"/>
+              </w:rPr>
+              <w:t>routing/services/matching.py</w:t>
+            </w:r>
+            <w:r>
+              <w:rPr>
+                <w:i/>
+                <w:color w:val="6B7689"/>
+                <w:sz w:val="17"/>
+              </w:rPr>
+              <w:t xml:space="preserve"> lines 45–76</w:t>
+            </w:r>
+          </w:p>
+        </w:tc>
+      </w:tr>
+    </w:tbl>
+    <w:p>
+      <w:pPr>
+        <w:spacing w:after="80"/>
+      </w:pPr>
+    </w:p>
+    <w:p>
+      <w:pPr>
         <w:spacing w:before="160" w:after="60"/>
         <w:jc w:val="center"/>
       </w:pPr>
@@ -1484,6 +2399,77 @@
     </w:p>
     <w:p>
       <w:pPr>
+        <w:spacing w:before="0" w:after="60"/>
+      </w:pPr>
+      <w:r>
+        <w:rPr>
+          <w:b/>
+          <w:i w:val="0"/>
+          <w:color w:val="1D4ED8"/>
+          <w:sz w:val="15"/>
+        </w:rPr>
+        <w:t>On screen while you present this</w:t>
+      </w:r>
+    </w:p>
+    <w:tbl>
+      <w:tblPr>
+        <w:tblW w:type="auto" w:w="0"/>
+        <w:tblLayout w:type="fixed"/>
+        <w:tblLook w:firstColumn="1" w:firstRow="1" w:lastColumn="0" w:lastRow="0" w:noHBand="0" w:noVBand="1" w:val="04A0"/>
+      </w:tblPr>
+      <w:tblGrid>
+        <w:gridCol w:w="4730"/>
+        <w:gridCol w:w="4730"/>
+      </w:tblGrid>
+      <w:tr>
+        <w:tc>
+          <w:tcPr>
+            <w:tcW w:type="dxa" w:w="1123"/>
+            <w:shd w:val="clear" w:color="auto" w:fill="E7EDFA"/>
+          </w:tcPr>
+          <w:p>
+            <w:r>
+              <w:rPr>
+                <w:b/>
+                <w:color w:val="1D4ED8"/>
+                <w:sz w:val="15"/>
+              </w:rPr>
+              <w:t>OPEN</w:t>
+            </w:r>
+          </w:p>
+        </w:tc>
+        <w:tc>
+          <w:tcPr>
+            <w:tcW w:type="dxa" w:w="8093"/>
+            <w:shd w:val="clear" w:color="auto" w:fill="F6F8FD"/>
+          </w:tcPr>
+          <w:p>
+            <w:r>
+              <w:rPr>
+                <w:rFonts w:ascii="Consolas" w:hAnsi="Consolas"/>
+                <w:sz w:val="19"/>
+              </w:rPr>
+              <w:t>routing/services/gazetteer.py</w:t>
+            </w:r>
+            <w:r>
+              <w:rPr>
+                <w:i/>
+                <w:color w:val="6B7689"/>
+                <w:sz w:val="17"/>
+              </w:rPr>
+              <w:t xml:space="preserve"> lines 56–85</w:t>
+            </w:r>
+          </w:p>
+        </w:tc>
+      </w:tr>
+    </w:tbl>
+    <w:p>
+      <w:pPr>
+        <w:spacing w:after="80"/>
+      </w:pPr>
+    </w:p>
+    <w:p>
+      <w:pPr>
         <w:spacing w:before="160" w:after="60"/>
         <w:jc w:val="center"/>
       </w:pPr>
@@ -1585,6 +2571,118 @@
     </w:p>
     <w:p>
       <w:pPr>
+        <w:spacing w:before="0" w:after="60"/>
+      </w:pPr>
+      <w:r>
+        <w:rPr>
+          <w:b/>
+          <w:i w:val="0"/>
+          <w:color w:val="1D4ED8"/>
+          <w:sz w:val="15"/>
+        </w:rPr>
+        <w:t>On screen while you present this</w:t>
+      </w:r>
+    </w:p>
+    <w:tbl>
+      <w:tblPr>
+        <w:tblW w:type="auto" w:w="0"/>
+        <w:tblLayout w:type="fixed"/>
+        <w:tblLook w:firstColumn="1" w:firstRow="1" w:lastColumn="0" w:lastRow="0" w:noHBand="0" w:noVBand="1" w:val="04A0"/>
+      </w:tblPr>
+      <w:tblGrid>
+        <w:gridCol w:w="4730"/>
+        <w:gridCol w:w="4730"/>
+      </w:tblGrid>
+      <w:tr>
+        <w:tc>
+          <w:tcPr>
+            <w:tcW w:type="dxa" w:w="1123"/>
+            <w:shd w:val="clear" w:color="auto" w:fill="E7EDFA"/>
+          </w:tcPr>
+          <w:p>
+            <w:r>
+              <w:rPr>
+                <w:b/>
+                <w:color w:val="1D4ED8"/>
+                <w:sz w:val="15"/>
+              </w:rPr>
+              <w:t>OPEN</w:t>
+            </w:r>
+          </w:p>
+        </w:tc>
+        <w:tc>
+          <w:tcPr>
+            <w:tcW w:type="dxa" w:w="8093"/>
+            <w:shd w:val="clear" w:color="auto" w:fill="F6F8FD"/>
+          </w:tcPr>
+          <w:p>
+            <w:r>
+              <w:rPr>
+                <w:rFonts w:ascii="Consolas" w:hAnsi="Consolas"/>
+                <w:sz w:val="19"/>
+              </w:rPr>
+              <w:t>config/settings.py</w:t>
+            </w:r>
+            <w:r>
+              <w:rPr>
+                <w:i/>
+                <w:color w:val="6B7689"/>
+                <w:sz w:val="17"/>
+              </w:rPr>
+              <w:t xml:space="preserve"> lines 179–208</w:t>
+            </w:r>
+          </w:p>
+        </w:tc>
+      </w:tr>
+      <w:tr>
+        <w:tc>
+          <w:tcPr>
+            <w:tcW w:type="dxa" w:w="1123"/>
+            <w:shd w:val="clear" w:color="auto" w:fill="E7EDFA"/>
+          </w:tcPr>
+          <w:p>
+            <w:r>
+              <w:rPr>
+                <w:b/>
+                <w:color w:val="1D4ED8"/>
+                <w:sz w:val="15"/>
+              </w:rPr>
+              <w:t>AND</w:t>
+            </w:r>
+          </w:p>
+        </w:tc>
+        <w:tc>
+          <w:tcPr>
+            <w:tcW w:type="dxa" w:w="8093"/>
+            <w:shd w:val="clear" w:color="auto" w:fill="F6F8FD"/>
+          </w:tcPr>
+          <w:p>
+            <w:r>
+              <w:rPr>
+                <w:rFonts w:ascii="Consolas" w:hAnsi="Consolas"/>
+                <w:sz w:val="19"/>
+              </w:rPr>
+              <w:t>.env.example</w:t>
+            </w:r>
+            <w:r>
+              <w:rPr>
+                <w:i/>
+                <w:color w:val="6B7689"/>
+                <w:sz w:val="17"/>
+              </w:rPr>
+              <w:t xml:space="preserve"> the same keys with their defaults</w:t>
+            </w:r>
+          </w:p>
+        </w:tc>
+      </w:tr>
+    </w:tbl>
+    <w:p>
+      <w:pPr>
+        <w:spacing w:after="80"/>
+      </w:pPr>
+    </w:p>
+    <w:p>
+      <w:pPr>
         <w:spacing w:before="160" w:after="60"/>
         <w:jc w:val="center"/>
       </w:pPr>
@@ -1699,6 +2797,118 @@
     </w:p>
     <w:p>
       <w:pPr>
+        <w:spacing w:before="0" w:after="60"/>
+      </w:pPr>
+      <w:r>
+        <w:rPr>
+          <w:b/>
+          <w:i w:val="0"/>
+          <w:color w:val="1D4ED8"/>
+          <w:sz w:val="15"/>
+        </w:rPr>
+        <w:t>On screen while you present this</w:t>
+      </w:r>
+    </w:p>
+    <w:tbl>
+      <w:tblPr>
+        <w:tblW w:type="auto" w:w="0"/>
+        <w:tblLayout w:type="fixed"/>
+        <w:tblLook w:firstColumn="1" w:firstRow="1" w:lastColumn="0" w:lastRow="0" w:noHBand="0" w:noVBand="1" w:val="04A0"/>
+      </w:tblPr>
+      <w:tblGrid>
+        <w:gridCol w:w="4730"/>
+        <w:gridCol w:w="4730"/>
+      </w:tblGrid>
+      <w:tr>
+        <w:tc>
+          <w:tcPr>
+            <w:tcW w:type="dxa" w:w="1123"/>
+            <w:shd w:val="clear" w:color="auto" w:fill="E7EDFA"/>
+          </w:tcPr>
+          <w:p>
+            <w:r>
+              <w:rPr>
+                <w:b/>
+                <w:color w:val="1D4ED8"/>
+                <w:sz w:val="15"/>
+              </w:rPr>
+              <w:t>OPEN</w:t>
+            </w:r>
+          </w:p>
+        </w:tc>
+        <w:tc>
+          <w:tcPr>
+            <w:tcW w:type="dxa" w:w="8093"/>
+            <w:shd w:val="clear" w:color="auto" w:fill="F6F8FD"/>
+          </w:tcPr>
+          <w:p>
+            <w:r>
+              <w:rPr>
+                <w:rFonts w:ascii="Consolas" w:hAnsi="Consolas"/>
+                <w:sz w:val="19"/>
+              </w:rPr>
+              <w:t>config/bootstrap.py</w:t>
+            </w:r>
+            <w:r>
+              <w:rPr>
+                <w:i/>
+                <w:color w:val="6B7689"/>
+                <w:sz w:val="17"/>
+              </w:rPr>
+              <w:t xml:space="preserve"> lines 33–62</w:t>
+            </w:r>
+          </w:p>
+        </w:tc>
+      </w:tr>
+      <w:tr>
+        <w:tc>
+          <w:tcPr>
+            <w:tcW w:type="dxa" w:w="1123"/>
+            <w:shd w:val="clear" w:color="auto" w:fill="E7EDFA"/>
+          </w:tcPr>
+          <w:p>
+            <w:r>
+              <w:rPr>
+                <w:b/>
+                <w:color w:val="1D4ED8"/>
+                <w:sz w:val="15"/>
+              </w:rPr>
+              <w:t>AND</w:t>
+            </w:r>
+          </w:p>
+        </w:tc>
+        <w:tc>
+          <w:tcPr>
+            <w:tcW w:type="dxa" w:w="8093"/>
+            <w:shd w:val="clear" w:color="auto" w:fill="F6F8FD"/>
+          </w:tcPr>
+          <w:p>
+            <w:r>
+              <w:rPr>
+                <w:rFonts w:ascii="Consolas" w:hAnsi="Consolas"/>
+                <w:sz w:val="19"/>
+              </w:rPr>
+              <w:t>vercel.json</w:t>
+            </w:r>
+            <w:r>
+              <w:rPr>
+                <w:i/>
+                <w:color w:val="6B7689"/>
+                <w:sz w:val="17"/>
+              </w:rPr>
+              <w:t xml:space="preserve"> the build command and the function budget</w:t>
+            </w:r>
+          </w:p>
+        </w:tc>
+      </w:tr>
+    </w:tbl>
+    <w:p>
+      <w:pPr>
+        <w:spacing w:after="80"/>
+      </w:pPr>
+    </w:p>
+    <w:p>
+      <w:pPr>
         <w:spacing w:before="160" w:after="60"/>
         <w:jc w:val="center"/>
       </w:pPr>
@@ -1813,6 +3023,118 @@
     </w:p>
     <w:p>
       <w:pPr>
+        <w:spacing w:before="0" w:after="60"/>
+      </w:pPr>
+      <w:r>
+        <w:rPr>
+          <w:b/>
+          <w:i w:val="0"/>
+          <w:color w:val="1D4ED8"/>
+          <w:sz w:val="15"/>
+        </w:rPr>
+        <w:t>On screen while you present this</w:t>
+      </w:r>
+    </w:p>
+    <w:tbl>
+      <w:tblPr>
+        <w:tblW w:type="auto" w:w="0"/>
+        <w:tblLayout w:type="fixed"/>
+        <w:tblLook w:firstColumn="1" w:firstRow="1" w:lastColumn="0" w:lastRow="0" w:noHBand="0" w:noVBand="1" w:val="04A0"/>
+      </w:tblPr>
+      <w:tblGrid>
+        <w:gridCol w:w="4730"/>
+        <w:gridCol w:w="4730"/>
+      </w:tblGrid>
+      <w:tr>
+        <w:tc>
+          <w:tcPr>
+            <w:tcW w:type="dxa" w:w="1123"/>
+            <w:shd w:val="clear" w:color="auto" w:fill="E7EDFA"/>
+          </w:tcPr>
+          <w:p>
+            <w:r>
+              <w:rPr>
+                <w:b/>
+                <w:color w:val="1D4ED8"/>
+                <w:sz w:val="15"/>
+              </w:rPr>
+              <w:t>OPEN</w:t>
+            </w:r>
+          </w:p>
+        </w:tc>
+        <w:tc>
+          <w:tcPr>
+            <w:tcW w:type="dxa" w:w="8093"/>
+            <w:shd w:val="clear" w:color="auto" w:fill="F6F8FD"/>
+          </w:tcPr>
+          <w:p>
+            <w:r>
+              <w:rPr>
+                <w:rFonts w:ascii="Consolas" w:hAnsi="Consolas"/>
+                <w:sz w:val="19"/>
+              </w:rPr>
+              <w:t>web/src/components/PlannerView.jsx</w:t>
+            </w:r>
+            <w:r>
+              <w:rPr>
+                <w:i/>
+                <w:color w:val="6B7689"/>
+                <w:sz w:val="17"/>
+              </w:rPr>
+              <w:t xml:space="preserve"> lines 14–41</w:t>
+            </w:r>
+          </w:p>
+        </w:tc>
+      </w:tr>
+      <w:tr>
+        <w:tc>
+          <w:tcPr>
+            <w:tcW w:type="dxa" w:w="1123"/>
+            <w:shd w:val="clear" w:color="auto" w:fill="E7EDFA"/>
+          </w:tcPr>
+          <w:p>
+            <w:r>
+              <w:rPr>
+                <w:b/>
+                <w:color w:val="1D4ED8"/>
+                <w:sz w:val="15"/>
+              </w:rPr>
+              <w:t>OPEN</w:t>
+            </w:r>
+          </w:p>
+        </w:tc>
+        <w:tc>
+          <w:tcPr>
+            <w:tcW w:type="dxa" w:w="8093"/>
+            <w:shd w:val="clear" w:color="auto" w:fill="F6F8FD"/>
+          </w:tcPr>
+          <w:p>
+            <w:r>
+              <w:rPr>
+                <w:rFonts w:ascii="Consolas" w:hAnsi="Consolas"/>
+                <w:sz w:val="19"/>
+              </w:rPr>
+              <w:t>web/src/components/RouteMap.jsx</w:t>
+            </w:r>
+            <w:r>
+              <w:rPr>
+                <w:i/>
+                <w:color w:val="6B7689"/>
+                <w:sz w:val="17"/>
+              </w:rPr>
+              <w:t xml:space="preserve"> lines 29–58</w:t>
+            </w:r>
+          </w:p>
+        </w:tc>
+      </w:tr>
+    </w:tbl>
+    <w:p>
+      <w:pPr>
+        <w:spacing w:after="80"/>
+      </w:pPr>
+    </w:p>
+    <w:p>
+      <w:pPr>
         <w:spacing w:before="160" w:after="60"/>
         <w:jc w:val="center"/>
       </w:pPr>
@@ -1981,6 +3303,118 @@
     </w:p>
     <w:p>
       <w:pPr>
+        <w:spacing w:before="0" w:after="60"/>
+      </w:pPr>
+      <w:r>
+        <w:rPr>
+          <w:b/>
+          <w:i w:val="0"/>
+          <w:color w:val="1D4ED8"/>
+          <w:sz w:val="15"/>
+        </w:rPr>
+        <w:t>On screen while you present this</w:t>
+      </w:r>
+    </w:p>
+    <w:tbl>
+      <w:tblPr>
+        <w:tblW w:type="auto" w:w="0"/>
+        <w:tblLayout w:type="fixed"/>
+        <w:tblLook w:firstColumn="1" w:firstRow="1" w:lastColumn="0" w:lastRow="0" w:noHBand="0" w:noVBand="1" w:val="04A0"/>
+      </w:tblPr>
+      <w:tblGrid>
+        <w:gridCol w:w="4730"/>
+        <w:gridCol w:w="4730"/>
+      </w:tblGrid>
+      <w:tr>
+        <w:tc>
+          <w:tcPr>
+            <w:tcW w:type="dxa" w:w="1123"/>
+            <w:shd w:val="clear" w:color="auto" w:fill="E7EDFA"/>
+          </w:tcPr>
+          <w:p>
+            <w:r>
+              <w:rPr>
+                <w:b/>
+                <w:color w:val="1D4ED8"/>
+                <w:sz w:val="15"/>
+              </w:rPr>
+              <w:t>OPEN</w:t>
+            </w:r>
+          </w:p>
+        </w:tc>
+        <w:tc>
+          <w:tcPr>
+            <w:tcW w:type="dxa" w:w="8093"/>
+            <w:shd w:val="clear" w:color="auto" w:fill="F6F8FD"/>
+          </w:tcPr>
+          <w:p>
+            <w:r>
+              <w:rPr>
+                <w:rFonts w:ascii="Consolas" w:hAnsi="Consolas"/>
+                <w:sz w:val="19"/>
+              </w:rPr>
+              <w:t>routing/tests/test_optimizer.py</w:t>
+            </w:r>
+            <w:r>
+              <w:rPr>
+                <w:i/>
+                <w:color w:val="6B7689"/>
+                <w:sz w:val="17"/>
+              </w:rPr>
+              <w:t xml:space="preserve"> lines 122–147</w:t>
+            </w:r>
+          </w:p>
+        </w:tc>
+      </w:tr>
+      <w:tr>
+        <w:tc>
+          <w:tcPr>
+            <w:tcW w:type="dxa" w:w="1123"/>
+            <w:shd w:val="clear" w:color="auto" w:fill="E7EDFA"/>
+          </w:tcPr>
+          <w:p>
+            <w:r>
+              <w:rPr>
+                <w:b/>
+                <w:color w:val="1D4ED8"/>
+                <w:sz w:val="15"/>
+              </w:rPr>
+              <w:t>RUN</w:t>
+            </w:r>
+          </w:p>
+        </w:tc>
+        <w:tc>
+          <w:tcPr>
+            <w:tcW w:type="dxa" w:w="8093"/>
+            <w:shd w:val="clear" w:color="auto" w:fill="F6F8FD"/>
+          </w:tcPr>
+          <w:p>
+            <w:r>
+              <w:rPr>
+                <w:rFonts w:ascii="Consolas" w:hAnsi="Consolas"/>
+                <w:sz w:val="19"/>
+              </w:rPr>
+              <w:t>python manage.py test routing</w:t>
+            </w:r>
+            <w:r>
+              <w:rPr>
+                <w:i/>
+                <w:color w:val="6B7689"/>
+                <w:sz w:val="17"/>
+              </w:rPr>
+              <w:t xml:space="preserve"> 70 tests, no network needed</w:t>
+            </w:r>
+          </w:p>
+        </w:tc>
+      </w:tr>
+    </w:tbl>
+    <w:p>
+      <w:pPr>
+        <w:spacing w:after="80"/>
+      </w:pPr>
+    </w:p>
+    <w:p>
+      <w:pPr>
         <w:spacing w:before="160" w:after="60"/>
         <w:jc w:val="center"/>
       </w:pPr>
@@ -2146,6 +3580,77 @@
         </w:rPr>
         <w:t>There is no authentication or rate limiting, the caches never expire, and the OpenStreetMap demo servers are fine for this but not for production.</w:t>
       </w:r>
+    </w:p>
+    <w:p>
+      <w:pPr>
+        <w:spacing w:before="0" w:after="60"/>
+      </w:pPr>
+      <w:r>
+        <w:rPr>
+          <w:b/>
+          <w:i w:val="0"/>
+          <w:color w:val="1D4ED8"/>
+          <w:sz w:val="15"/>
+        </w:rPr>
+        <w:t>On screen while you present this</w:t>
+      </w:r>
+    </w:p>
+    <w:tbl>
+      <w:tblPr>
+        <w:tblW w:type="auto" w:w="0"/>
+        <w:tblLayout w:type="fixed"/>
+        <w:tblLook w:firstColumn="1" w:firstRow="1" w:lastColumn="0" w:lastRow="0" w:noHBand="0" w:noVBand="1" w:val="04A0"/>
+      </w:tblPr>
+      <w:tblGrid>
+        <w:gridCol w:w="4730"/>
+        <w:gridCol w:w="4730"/>
+      </w:tblGrid>
+      <w:tr>
+        <w:tc>
+          <w:tcPr>
+            <w:tcW w:type="dxa" w:w="1123"/>
+            <w:shd w:val="clear" w:color="auto" w:fill="E7EDFA"/>
+          </w:tcPr>
+          <w:p>
+            <w:r>
+              <w:rPr>
+                <w:b/>
+                <w:color w:val="1D4ED8"/>
+                <w:sz w:val="15"/>
+              </w:rPr>
+              <w:t>OPEN</w:t>
+            </w:r>
+          </w:p>
+        </w:tc>
+        <w:tc>
+          <w:tcPr>
+            <w:tcW w:type="dxa" w:w="8093"/>
+            <w:shd w:val="clear" w:color="auto" w:fill="F6F8FD"/>
+          </w:tcPr>
+          <w:p>
+            <w:r>
+              <w:rPr>
+                <w:rFonts w:ascii="Consolas" w:hAnsi="Consolas"/>
+                <w:sz w:val="19"/>
+              </w:rPr>
+              <w:t>https://spotter-fuel-route.vercel.app/api/v1/docs/</w:t>
+            </w:r>
+            <w:r>
+              <w:rPr>
+                <w:i/>
+                <w:color w:val="6B7689"/>
+                <w:sz w:val="17"/>
+              </w:rPr>
+              <w:t xml:space="preserve"> leave the API docs up while you close</w:t>
+            </w:r>
+          </w:p>
+        </w:tc>
+      </w:tr>
+    </w:tbl>
+    <w:p>
+      <w:pPr>
+        <w:spacing w:after="80"/>
+      </w:pPr>
     </w:p>
     <w:p>
       <w:pPr>

</xml_diff>